<commit_message>
docs(fase-1): corregir definicion de proyecto APT (ES/EN)
</commit_message>
<xml_diff>
--- a/Fase 1/Evidencias Grupales/1.5_GuiaEstudiante_Fase 1_Definicion Proyecto APT (Español).docx
+++ b/Fase 1/Evidencias Grupales/1.5_GuiaEstudiante_Fase 1_Definicion Proyecto APT (Español).docx
@@ -920,7 +920,7 @@
                 <w:rFonts w:ascii="Arial" w:cs="Arial" w:eastAsia="Arial" w:hAnsi="Arial"/>
                 <w:rtl w:val="0"/>
               </w:rPr>
-              <w:t xml:space="preserve">La plataforma integra dos áreas operativas clave: por un lado, el control, trazabilidad y préstamo de equipamiento tecnológico (notebooks, proyectores, tablets y periféricos); y por otro, un canal de atención donde los colaboradores pueden reportar incidentes, requerir servicios informáticos y solicitar el mantenimiento o reparación de computadores y dispositivos de trabajo.</w:t>
+              <w:t xml:space="preserve">La plataforma integra dos áreas operativas clave: por un lado, el control, trazabilidad y asignación de equipamiento tecnológico (notebooks, proyectores, tablets y periféricos); y por otro, un canal de atención donde los colaboradores pueden reportar incidentes, requerir servicios informáticos y solicitar el mantenimiento o reparación de computadores y dispositivos de trabajo.</w:t>
             </w:r>
           </w:p>
           <w:p>
@@ -1126,7 +1126,7 @@
                 <w:rFonts w:ascii="Arial" w:cs="Arial" w:eastAsia="Arial" w:hAnsi="Arial"/>
                 <w:rtl w:val="0"/>
               </w:rPr>
-              <w:t xml:space="preserve">Diseño, normalización y construcción de un modelo de base de datos relacional de al menos 30 tablas (en PostgreSQL), orientado a gestionar el inventario de activos TI, solicitudes de préstamo, tickets de soporte técnico, órdenes de trabajo para reparación, asignación de repuestos, diagnósticos y auditoría de eventos.</w:t>
+              <w:t xml:space="preserve">Diseño, normalización y construcción de un modelo de base de datos relacional de al menos 30 tablas (en PostgreSQL), orientado a gestionar el inventario de activos TI, solicitudes de asignación, tickets de soporte técnico, órdenes de trabajo para reparación, asignación de repuestos, diagnósticos y auditoría de eventos.</w:t>
             </w:r>
           </w:p>
           <w:p>
@@ -1327,7 +1327,7 @@
                 <w:rFonts w:ascii="Arial" w:cs="Arial" w:eastAsia="Arial" w:hAnsi="Arial"/>
                 <w:rtl w:val="0"/>
               </w:rPr>
-              <w:t xml:space="preserve">), estructurando el código bajo patrones de diseño limpios y modulares para asegurar mantenibilidad, escalabilidad e integración fluida entre los módulos de inventario, préstamos y tickets de reparación.</w:t>
+              <w:t xml:space="preserve">), estructurando el código bajo patrones de diseño limpios y modulares para asegurar mantenibilidad, escalabilidad e integración fluida entre los módulos de inventario, asignación y tickets de reparación.</w:t>
             </w:r>
           </w:p>
           <w:p>
@@ -1509,7 +1509,7 @@
                 <w:rFonts w:ascii="Arial" w:cs="Arial" w:eastAsia="Arial" w:hAnsi="Arial"/>
                 <w:rtl w:val="0"/>
               </w:rPr>
-              <w:t xml:space="preserve"> dos procesos tradicionalmente aislados: la asignación/préstamo de recursos tecnológicos y el soporte técnico/mantenimiento de equipos. El sistema implementará una máquina de estados donde los reportes de fallas o solicitudes de reparación actualizan automáticamente la disponibilidad física de los dispositivos en el inventario, reduciendo tiempos muertos, eliminando planillas manuales y entregando indicadores clave de rendimiento (KPIs) para la toma de decisiones TI.</w:t>
+              <w:t xml:space="preserve"> dos procesos tradicionalmente aislados: la asignación de recursos tecnológicos y el soporte técnico/mantenimiento de equipos. El sistema implementará una máquina de estados donde los reportes de fallas o solicitudes de reparación actualizan automáticamente la disponibilidad física de los dispositivos en el inventario, reduciendo tiempos muertos, eliminando planillas manuales y entregando indicadores clave de rendimiento (KPIs) para la toma de decisiones TI.</w:t>
             </w:r>
           </w:p>
           <w:p>
@@ -1880,7 +1880,7 @@
                 <w:rFonts w:ascii="Arial" w:cs="Arial" w:eastAsia="Arial" w:hAnsi="Arial"/>
                 <w:rtl w:val="0"/>
               </w:rPr>
-              <w:t xml:space="preserve">). Si bien muchas organizaciones cuentan con herramientas digitales básicas o planillas para registrar préstamos de equipamiento (notebooks, proyectores, tablets), comúnmente enfrentan una desconexión crítica entre la disponibilidad de los equipos y su mantenimiento técnico. Cuando un equipo presenta fallas o requiere reparación, el seguimiento se realiza de manera informal o fragmentada, perdiendo la trazabilidad del estado físico y operativo del activo.</w:t>
+              <w:t xml:space="preserve">). Si bien muchas organizaciones cuentan con herramientas digitales básicas o planillas para registrar asignación de equipamiento (notebooks, proyectores, tablets), comúnmente enfrentan una desconexión crítica entre la disponibilidad de los equipos y su mantenimiento técnico. Cuando un equipo presenta fallas o requiere reparación, el seguimiento se realiza de manera informal o fragmentada, perdiendo la trazabilidad del estado físico y operativo del activo.</w:t>
             </w:r>
           </w:p>
           <w:p>
@@ -1896,7 +1896,7 @@
                 <w:rFonts w:ascii="Arial" w:cs="Arial" w:eastAsia="Arial" w:hAnsi="Arial"/>
                 <w:rtl w:val="0"/>
               </w:rPr>
-              <w:t xml:space="preserve">En este contexto, SIGET propone una plataforma integrada que unifica el control de préstamos con la gestión de solicitudes de soporte técnico, mantenimiento y reparación de hardware/software. De esta forma, el sistema automatiza el ciclo de vida del equipamiento: la apertura de un ticket de reparación o diagnóstico técnico actualiza inmediatamente el estado del inventario, evitando asignaciones indebidas y asegurando que la infraestructura tecnológica de la organización se mantenga operativa, trazable y segura.</w:t>
+              <w:t xml:space="preserve">En este contexto, SIGET propone una plataforma integrada que unifica el control de asignación con la gestión de solicitudes de soporte técnico, mantenimiento y reparación de hardware/software. De esta forma, el sistema automatiza el ciclo de vida del equipamiento: la apertura de un ticket de reparación o diagnóstico técnico actualiza inmediatamente el estado del inventario, evitando asignaciones indebidas y asegurando que la infraestructura tecnológica de la organización se mantenga operativa, trazable y segura.</w:t>
             </w:r>
             <w:r>
               <w:rPr>
@@ -2135,7 +2135,7 @@
                 <w:rFonts w:ascii="Arial" w:cs="Arial" w:eastAsia="Arial" w:hAnsi="Arial"/>
                 <w:rtl w:val="0"/>
               </w:rPr>
-              <w:t xml:space="preserve"> Quienes sufren retrasos en sus labores cuando un equipo de trabajo falla o carecen de un canal formal para solicitar soporte técnico y pedir préstamos de dispositivos de manera rápida y transparente.</w:t>
+              <w:t xml:space="preserve"> Quienes sufren retrasos en sus labores cuando un equipo de trabajo falla o carecen de un canal formal para solicitar soporte técnico y pedir asignación de dispositivos de manera rápida y transparente.</w:t>
             </w:r>
           </w:p>
           <w:p>
@@ -2296,7 +2296,7 @@
                 <w:rFonts w:ascii="Arial" w:cs="Arial" w:eastAsia="Arial" w:hAnsi="Arial"/>
                 <w:rtl w:val="0"/>
               </w:rPr>
-              <w:t xml:space="preserve"> Unifica en una sola lógica de negocio el soporte técnico y el préstamo de equipos. Si un computador ingresa a taller con una orden de trabajo por reparación, el sistema bloquea automáticamente su disponibilidad para asignación, eliminando inconsistencias operativas.</w:t>
+              <w:t xml:space="preserve"> Unifica en una sola lógica de negocio el soporte técnico y la asignación de equipos. Si un computador ingresa a taller con una orden de trabajo por reparación, el sistema bloquea automáticamente su disponibilidad para asignación, eliminando inconsistencias operativas.</w:t>
             </w:r>
           </w:p>
           <w:p>
@@ -2323,7 +2323,7 @@
                 <w:rFonts w:ascii="Arial" w:cs="Arial" w:eastAsia="Arial" w:hAnsi="Arial"/>
                 <w:rtl w:val="0"/>
               </w:rPr>
-              <w:t xml:space="preserve"> Ofrece un portal Web intuitivo enfocado en el autoservicio del usuario (solicitud de préstamos y levantamiento de tickets) y una aplicación de Escritorio orientada a la gestión técnica avanzada (diagnósticos técnicos, control de piezas, trazabilidad y reportería de gestión).</w:t>
+              <w:t xml:space="preserve"> Ofrece un portal Web intuitivo enfocado en el autoservicio del usuario (solicitud de asignaciones y levantamiento de tickets) y una aplicación de Escritorio orientada a la gestión técnica avanzada (diagnósticos técnicos, control de piezas, trazabilidad y reportería de gestión).</w:t>
             </w:r>
           </w:p>
           <w:p>
@@ -2561,7 +2561,7 @@
                 <w:rFonts w:ascii="Arial" w:cs="Arial" w:eastAsia="Arial" w:hAnsi="Arial"/>
                 <w:rtl w:val="0"/>
               </w:rPr>
-              <w:t xml:space="preserve">El objetivo del proyecto SIGET (Sistema Integral de Gestión de Equipos y Soporte Tecnológico) es desarrollar e implementar una solución informática integral orientada a optimizar, centralizar y sincronizar dos procesos operativos críticos para el área de TI: el control y préstamo de activos tecnológicos institucionales, y la gestión de requerimientos de soporte técnico y mantenimiento bajo un modelo formal de Mesa de Ayuda (</w:t>
+              <w:t xml:space="preserve">El objetivo del proyecto SIGET (Sistema Integral de Gestión de Equipos y Soporte Tecnológico) es desarrollar e implementar una solución informática integral orientada a optimizar, centralizar y sincronizar dos procesos operativos críticos para el área de TI: el control y asignación de activos tecnológicos institucionales, y la gestión de requerimientos de soporte técnico y mantenimiento bajo un modelo formal de Mesa de Ayuda (</w:t>
             </w:r>
             <w:r>
               <w:rPr>
@@ -2577,7 +2577,7 @@
                 <w:rFonts w:ascii="Arial" w:cs="Arial" w:eastAsia="Arial" w:hAnsi="Arial"/>
                 <w:rtl w:val="0"/>
               </w:rPr>
-              <w:t xml:space="preserve">). El sistema no se limita a un registro estático de inventario, sino que implementa un flujo transaccional dinámico: permite a los colaboradores solicitar préstamos de equipamiento (notebooks, proyectores, periféricos) y levantar tickets por fallas o requerimientos de servicio técnico (reparación de computadores, mantención preventiva o problemas de software). De esta manera, el sistema vincula la operatividad técnica con la disponibilidad física de los recursos, inhabilitando automáticamente los equipos que ingresan a taller y garantizando una trazabilidad completa del parque tecnológico.</w:t>
+              <w:t xml:space="preserve">). El sistema no se limita a un registro estático de inventario, sino que implementa un flujo transaccional dinámico: permite a los colaboradores solicitar asignaciones de equipamiento (notebooks, proyectores, periféricos) y levantar tickets por fallas o requerimientos de servicio técnico (reparación de computadores, mantención preventiva o problemas de software). De esta manera, el sistema vincula la operatividad técnica con la disponibilidad física de los recursos, inhabilitando automáticamente los equipos que ingresan a taller y garantizando una trazabilidad completa del parque tecnológico.</w:t>
             </w:r>
           </w:p>
           <w:p>
@@ -2636,7 +2636,7 @@
                 <w:rFonts w:ascii="Arial" w:cs="Arial" w:eastAsia="Arial" w:hAnsi="Arial"/>
                 <w:rtl w:val="0"/>
               </w:rPr>
-              <w:t xml:space="preserve"> Interfaz ágil y responsiva orientada a los usuarios finales de la organización. A través de este portal, los trabajadores pueden consultar el catálogo de equipos disponibles, solicitar préstamos, reportar incidentes, emitir solicitudes de reparación técnica y dar seguimiento en tiempo real al estado de sus tickets.</w:t>
+              <w:t xml:space="preserve"> Interfaz ágil y responsiva orientada a los usuarios finales de la organización. A través de este portal, los trabajadores pueden consultar el catálogo de equipos disponibles, solicitar asignaciones, reportar incidentes, emitir solicitudes de reparación técnica y dar seguimiento en tiempo real al estado de sus tickets.</w:t>
             </w:r>
           </w:p>
           <w:p>
@@ -2663,7 +2663,7 @@
                 <w:rFonts w:ascii="Arial" w:cs="Arial" w:eastAsia="Arial" w:hAnsi="Arial"/>
                 <w:rtl w:val="0"/>
               </w:rPr>
-              <w:t xml:space="preserve"> Diseñada exclusivamente para el equipo de soporte técnico y los administradores de infraestructura TI. Esta herramienta nativa permite gestionar las colas de tickets de soporte, derivar órdenes de trabajo a técnicos especialistas, registrar diagnósticos detallados, documentar repuestos o componentes utilizados, despachar/recibir préstamos de bodega e interactuar de forma ágil con periféricos locales (como lectores de códigos de barra o QR) para optimizar el control de inventario.</w:t>
+              <w:t xml:space="preserve"> Diseñada exclusivamente para el equipo de soporte técnico y los administradores de infraestructura TI. Esta herramienta nativa permite gestionar las colas de tickets de soporte, derivar órdenes de trabajo a técnicos especialistas, registrar diagnósticos detallados, documentar repuestos o componentes utilizados, despachar/recibir asignaciones de bodega e interactuar de forma ágil con periféricos locales (como lectores de códigos de barra o QR) para optimizar el control de inventario.</w:t>
             </w:r>
           </w:p>
           <w:p>
@@ -2731,14 +2731,14 @@
                 <w:iCs w:val="1"/>
                 <w:rtl w:val="0"/>
               </w:rPr>
-              <w:t xml:space="preserve">API de Gestión de Activos y Préstamos</w:t>
-            </w:r>
-            <w:r>
-              <w:rPr>
-                <w:rFonts w:ascii="Arial" w:cs="Arial" w:eastAsia="Arial" w:hAnsi="Arial"/>
-                <w:rtl w:val="0"/>
-              </w:rPr>
-              <w:t xml:space="preserve"> (administración del catálogo, reservas y estados de disponibilidad) y la </w:t>
+              <w:t xml:space="preserve">API de Gestión de Activos y asignaciones</w:t>
+            </w:r>
+            <w:r>
+              <w:rPr>
+                <w:rFonts w:ascii="Arial" w:cs="Arial" w:eastAsia="Arial" w:hAnsi="Arial"/>
+                <w:rtl w:val="0"/>
+              </w:rPr>
+              <w:t xml:space="preserve">(administración del catálogo, reservas y estados de disponibilidad) y la </w:t>
             </w:r>
             <w:r>
               <w:rPr>
@@ -2781,7 +2781,7 @@
                 <w:rFonts w:ascii="Arial" w:cs="Arial" w:eastAsia="Arial" w:hAnsi="Arial"/>
                 <w:rtl w:val="0"/>
               </w:rPr>
-              <w:t xml:space="preserve"> Se integrarán servicios de mensajería/notificaciones (para alertar a los usuarios vía correo sobre cambios de estado en sus reparaciones o vencimiento de préstamos), una API de generación y lectura de códigos QR/barras para la identificación física de activos, y una API para la autenticación centralizada de credenciales.</w:t>
+              <w:t xml:space="preserve"> Se integrarán servicios de mensajería/notificaciones (para alertar a los usuarios vía correo sobre cambios de estado en sus reparaciones o vencimiento de asignaciones), una API de generación y lectura de códigos QR/barras para la identificación física de activos, y una API para la autenticación centralizada de credenciales.</w:t>
             </w:r>
           </w:p>
           <w:p>
@@ -2838,7 +2838,7 @@
                 <w:iCs w:val="1"/>
                 <w:rtl w:val="0"/>
               </w:rPr>
-              <w:t xml:space="preserve">Gestión de Activos Tecnológicos, Préstamos y Trazabilidad, Mesa de Ayuda y Órdenes de Reparación, Control de Usuarios y Roles (RBAC), y Auditoría y Niveles de Servicio (SLA)</w:t>
+              <w:t xml:space="preserve">Gestión de Activos Tecnológicos, asignaciones y Trazabilidad, Mesa de Ayuda y Órdenes de Reparación, Control de Usuarios y Roles (RBAC), y Auditoría y Niveles de Servicio (SLA)</w:t>
             </w:r>
             <w:r>
               <w:rPr>
@@ -3005,7 +3005,7 @@
                 <w:rFonts w:ascii="Arial" w:cs="Arial" w:eastAsia="Arial" w:hAnsi="Arial"/>
                 <w:rtl w:val="0"/>
               </w:rPr>
-              <w:t xml:space="preserve"> Se materializa en la construcción dual de una plataforma Web para la autogestión de usuarios (solicitud de préstamos y reportes de fallas) y una aplicación de Escritorio administrativa/operativa para técnicos de soporte (gestión de órdenes de trabajo, diagnósticos e inventario de repuestos), utilizando frameworks consolidados (Django y </w:t>
+              <w:t xml:space="preserve"> Se materializa en la construcción dual de una plataforma Web para la autogestión de usuarios (solicitud de asignaciones y reportes de fallas) y una aplicación de Escritorio administrativa/operativa para técnicos de soporte (gestión de órdenes de trabajo, diagnósticos e inventario de repuestos), utilizando frameworks consolidados (Django y </w:t>
             </w:r>
             <w:r>
               <w:rPr>
@@ -3047,7 +3047,7 @@
                 <w:rFonts w:ascii="Arial" w:cs="Arial" w:eastAsia="Arial" w:hAnsi="Arial"/>
                 <w:rtl w:val="0"/>
               </w:rPr>
-              <w:t xml:space="preserve"> Se refleja en el diseño e implementación en PostgreSQL de una base de datos relacional de al menos 30 tablas estrictamente normalizadas. Esta estructura soporta la persistencia transaccional del inventario, la trazabilidad de préstamos y la gestión de tickets de servicio y reparaciones.</w:t>
+              <w:t xml:space="preserve"> Se refleja en el diseño e implementación en PostgreSQL de una base de datos relacional de al menos 30 tablas estrictamente normalizadas. Esta estructura soporta la persistencia transaccional del inventario, la trazabilidad de asignaciones y la gestión de tickets de servicio y reparaciones.</w:t>
               <w:br w:type="textWrapping"/>
             </w:r>
           </w:p>
@@ -3336,7 +3336,7 @@
                 <w:rFonts w:ascii="Arial" w:cs="Arial" w:eastAsia="Arial" w:hAnsi="Arial"/>
                 <w:rtl w:val="0"/>
               </w:rPr>
-              <w:t xml:space="preserve">La viabilidad técnica se sustenta en un stack tecnológico estandarizado y dominado por el equipo. Se utilizará Python como lenguaje de programación principal. Para la plataforma Web de autoservicio orientada a los colaboradores (solicitud de préstamos y levantamiento de tickets) se empleará Django junto con HTML5, CSS3 y JavaScript. En la capa de servicios, se implementará Django REST Framework para desarrollar 2 APIs propias (gestión de activos/préstamos y mesa de ayuda/reparaciones) y para estructurar el consumo e integración de 3 APIs externas (notificaciones por correo electrónico, generación/lectura de códigos QR para inventario y autenticación de usuarios).</w:t>
+              <w:t xml:space="preserve">La viabilidad técnica se sustenta en un stack tecnológico estandarizado y dominado por el equipo. Se utilizará Python como lenguaje de programación principal. Para la plataforma Web de autoservicio orientada a los colaboradores (solicitud de asignaciones y levantamiento de tickets) se empleará Django junto con HTML5, CSS3 y JavaScript. En la capa de servicios, se implementará Django REST Framework para desarrollar 2 APIs propias (gestión de activos/asignaciones y mesa de ayuda/reparaciones) y para estructurar el consumo e integración de 3 APIs externas (notificaciones por correo electrónico, generación/lectura de códigos QR para inventario y autenticación de usuarios).</w:t>
             </w:r>
           </w:p>
           <w:p>
@@ -3883,7 +3883,7 @@
                 <w:rFonts w:ascii="Arial" w:cs="Arial" w:eastAsia="Arial" w:hAnsi="Arial"/>
                 <w:rtl w:val="0"/>
               </w:rPr>
-              <w:t xml:space="preserve">Desarrollar e implementar la solución informática integral SIGET mediante una arquitectura cliente-servidor dual (plataforma Web y aplicación de Escritorio), con el fin de centralizar la administración de activos TI, automatizar el control y trazabilidad de préstamos, y gestionar solicitudes de soporte técnico y órdenes de reparación de equipamiento bajo un modelo de Service Desk para una organización cliente.</w:t>
+              <w:t xml:space="preserve">Desarrollar e implementar la solución informática integral SIGET mediante una arquitectura cliente-servidor dual (plataforma Web y aplicación de Escritorio), con el fin de centralizar la administración de activos TI, automatizar el control y trazabilidad de asignaciones, y gestionar solicitudes de soporte técnico y órdenes de reparación de equipamiento bajo un modelo de Service Desk para una organización cliente.</w:t>
             </w:r>
             <w:r>
               <w:rPr>
@@ -3948,7 +3948,7 @@
                 <w:rFonts w:ascii="Arial" w:cs="Arial" w:eastAsia="Arial" w:hAnsi="Arial"/>
                 <w:rtl w:val="0"/>
               </w:rPr>
-              <w:t xml:space="preserve">Levantar y analizar los requerimientos funcionales, no funcionales y de seguridad de los procesos de préstamo de activos tecnológicos y de atención de soporte técnico (</w:t>
+              <w:t xml:space="preserve">Levantar y analizar los requerimientos funcionales, no funcionales y de seguridad de los procesos de asignación de activos tecnológicos y de atención de soporte técnico (</w:t>
             </w:r>
             <w:r>
               <w:rPr>
@@ -3990,7 +3990,7 @@
                 <w:rFonts w:ascii="Arial" w:cs="Arial" w:eastAsia="Arial" w:hAnsi="Arial"/>
                 <w:rtl w:val="0"/>
               </w:rPr>
-              <w:t xml:space="preserve">Diseñar y construir un modelo de base de datos relacional normalizado compuesto por al menos 30 tablas en PostgreSQL, garantizando la consistencia, integridad referencial y escalabilidad para la administración de activos TI, solicitudes de préstamo, tickets de soporte, órdenes de trabajo de reparación, catálogo de repuestos y bitácoras de auditoría.</w:t>
+              <w:t xml:space="preserve">Diseñar y construir un modelo de base de datos relacional normalizado compuesto por al menos 30 tablas en PostgreSQL, garantizando la consistencia, integridad referencial y escalabilidad para la administración de activos TI, solicitudes de asignación, tickets de soporte, órdenes de trabajo de reparación, catálogo de repuestos y bitácoras de auditoría.</w:t>
             </w:r>
           </w:p>
           <w:p>
@@ -4016,7 +4016,7 @@
                 <w:rFonts w:ascii="Arial" w:cs="Arial" w:eastAsia="Arial" w:hAnsi="Arial"/>
                 <w:rtl w:val="0"/>
               </w:rPr>
-              <w:t xml:space="preserve">Desarrollar 2 APIs RESTful propias (para la administración del catálogo/préstamos y para la gestión de estados de tickets/reparaciones) e integrar el consumo de 3 APIs externas (servicios de notificación por correo, generación/lectura de códigos QR y autenticación de usuarios), garantizando la interoperabilidad fluida entre las plataformas Web y de Escritorio.</w:t>
+              <w:t xml:space="preserve">Desarrollar 2 APIs RESTful propias (para la administración del catálogo/asignaciones para la gestión de estados de tickets/reparaciones) e integrar el consumo de 3 APIs externas (servicios de notificación por correo, generación/lectura de códigos QR y autenticación de usuarios), garantizando la interoperabilidad fluida entre las plataformas Web y de Escritorio.</w:t>
             </w:r>
           </w:p>
           <w:p>
@@ -4042,7 +4042,7 @@
                 <w:rFonts w:ascii="Arial" w:cs="Arial" w:eastAsia="Arial" w:hAnsi="Arial"/>
                 <w:rtl w:val="0"/>
               </w:rPr>
-              <w:t xml:space="preserve">Construir los módulos del frontend y backend de la plataforma Web de autoservicio (orientada a colaboradores para solicitud de préstamos y reporte de fallas) y de la aplicación de Escritorio administrativa (orientada a técnicos para la resolución de órdenes de trabajo, diagnósticos y control de inventario), empleando Python, Django y </w:t>
+              <w:t xml:space="preserve">Construir los módulos del frontend y backend de la plataforma Web de autoservicio (orientada a colaboradores para solicitud de asignaciones y reporte de fallas) y de la aplicación de Escritorio administrativa (orientada a técnicos para la resolución de órdenes de trabajo, diagnósticos y control de inventario), empleando Python, Django y </w:t>
             </w:r>
             <w:r>
               <w:rPr>
@@ -4622,7 +4622,7 @@
                 <w:rFonts w:ascii="Arial" w:cs="Arial" w:eastAsia="Arial" w:hAnsi="Arial"/>
                 <w:rtl w:val="0"/>
               </w:rPr>
-              <w:t xml:space="preserve"> Repositorio central de requerimientos gestionado a través de Historias de Usuario (con estimaciones en puntos de historia y criterios de aceptación específicos), estructurado para abordar los módulos de gestión de inventario, préstamos de equipamiento, tickets de falla, órdenes de trabajo de reparación y niveles de servicio (SLA).</w:t>
+              <w:t xml:space="preserve"> Repositorio central de requerimientos gestionado a través de Historias de Usuario (con estimaciones en puntos de historia y criterios de aceptación específicos), estructurado para abordar los módulos de gestión de inventario, asignaciones de equipamiento, tickets de falla, órdenes de trabajo de reparación y niveles de servicio (SLA).</w:t>
             </w:r>
           </w:p>
           <w:p>
@@ -5518,7 +5518,7 @@
                 <w:rFonts w:ascii="Arial" w:cs="Arial" w:eastAsia="Arial" w:hAnsi="Arial"/>
                 <w:rtl w:val="0"/>
               </w:rPr>
-              <w:t xml:space="preserve">Definir la arquitectura cliente-servidor desacoplada. Desarrollar en Python/Django la lógica de negocio central. Construir las 2 APIs RESTful propias (API de Gestión de Activos/Préstamos y API de Service Desk/Reparaciones) mediante Django REST Framework. Implementar el consumo e integración de las 3 APIs externas (notificaciones por correo, lectura/generación de códigos QR y autenticación centralizada).</w:t>
+              <w:t xml:space="preserve">Definir la arquitectura cliente-servidor desacoplada. Desarrollar en Python/Django la lógica de negocio central. Construir las 2 APIs RESTful propias (API de Gestión de Activos/asignaciones y API de Service Desk/Reparaciones) mediante Django REST Framework. Implementar el consumo e integración de las 3 APIs externas (notificaciones por correo, lectura/generación de códigos QR y autenticación centralizada).</w:t>
             </w:r>
           </w:p>
           <w:p>
@@ -5549,7 +5549,7 @@
                 <w:rFonts w:ascii="Arial" w:cs="Arial" w:eastAsia="Arial" w:hAnsi="Arial"/>
                 <w:rtl w:val="0"/>
               </w:rPr>
-              <w:t xml:space="preserve">Diseñar y codificar la Plataforma Web de autoservicio (HTML5, CSS3, JavaScript) para el catálogo de activos, solicitudes de préstamos y levantamiento de tickets de incidentes. Construir la interfaz nativa de la Aplicación de Escritorio en </w:t>
+              <w:t xml:space="preserve">Diseñar y codificar la Plataforma Web de autoservicio (HTML5, CSS3, JavaScript) para el catálogo de activos, solicitudes de asignaciones y levantamiento de tickets de incidentes. Construir la interfaz nativa de la Aplicación de Escritorio en </w:t>
             </w:r>
             <w:r>
               <w:rPr>
@@ -5608,7 +5608,7 @@
                 <w:rFonts w:ascii="Arial" w:cs="Arial" w:eastAsia="Arial" w:hAnsi="Arial"/>
                 <w:rtl w:val="0"/>
               </w:rPr>
-              <w:t xml:space="preserve">Diseñar, normalizar y construir el modelo de base de datos relacional de al menos 30 tablas en PostgreSQL. Estructurar los esquemas y restricciones de integridad para el inventario técnico, préstamos, máquinas de estados de tickets, órdenes de trabajo de reparación, catálogo de repuestos, roles y auditoría. Optimizar consultas relacionales, índices y procedimientos de persistencia.</w:t>
+              <w:t xml:space="preserve">Diseñar, normalizar y construir el modelo de base de datos relacional de al menos 30 tablas en PostgreSQL. Estructurar los esquemas y restricciones de integridad para el inventario técnico, asignaciones, máquinas de estados de tickets, órdenes de trabajo de reparación, catálogo de repuestos, roles y auditoría. Optimizar consultas relacionales, índices y procedimientos de persistencia.</w:t>
             </w:r>
           </w:p>
           <w:p>
@@ -6592,7 +6592,7 @@
                 <w:color w:val="1f3864"/>
                 <w:rtl w:val="0"/>
               </w:rPr>
-              <w:t xml:space="preserve">Archivo estructurado (adoptando la plantilla de backlog) que contiene las historias de usuario estimadas en puntos de historia, criterios de aceptación y el desglose de tareas de los primeros Sprints correspondientes a los módulos de autenticación, catálogo de activos y préstamos iniciales.</w:t>
+              <w:t xml:space="preserve">Archivo estructurado (adoptando la plantilla de backlog) que contiene las historias de usuario estimadas en puntos de historia, criterios de aceptación y el desglose de tareas de los primeros Sprints correspondientes a los módulos de autenticación, catálogo de activos y asignaciones iniciales.</w:t>
             </w:r>
           </w:p>
         </w:tc>
@@ -6832,7 +6832,7 @@
                 <w:color w:val="1f3864"/>
                 <w:rtl w:val="0"/>
               </w:rPr>
-              <w:t xml:space="preserve">), el diagrama de arquitectura cliente-servidor desacoplada, requerimientos no funcionales (RNF), diagramas UML base (casos de uso de préstamos y tickets) y el diagrama entidad-relación (ER) inicial.</w:t>
+              <w:t xml:space="preserve">), el diagrama de arquitectura cliente-servidor desacoplada, requerimientos no funcionales (RNF), diagramas UML base (casos de uso de asignaciones y tickets) y el diagrama entidad-relación (ER) inicial.</w:t>
             </w:r>
             <w:r>
               <w:rPr>
@@ -7707,7 +7707,7 @@
                 <w:color w:val="1f3864"/>
                 <w:rtl w:val="0"/>
               </w:rPr>
-              <w:t xml:space="preserve">Scripts DDL y DML finales en PostgreSQL con al menos 30 tablas normalizadas, cubriendo activos, préstamos, estados, tickets de soporte, diagnósticos técnicos, órdenes de trabajo, repuestos y registros de auditoría, junto a un set de datos de prueba poblado. </w:t>
+              <w:t xml:space="preserve">Scripts DDL y DML finales en PostgreSQL con al menos 30 tablas normalizadas, cubriendo activos, asignaciones, estados, tickets de soporte, diagnósticos técnicos, órdenes de trabajo, repuestos y registros de auditoría, junto a un set de datos de prueba poblado. </w:t>
             </w:r>
           </w:p>
         </w:tc>
@@ -7882,7 +7882,7 @@
                 <w:color w:val="1f3864"/>
                 <w:rtl w:val="0"/>
               </w:rPr>
-              <w:t xml:space="preserve">Código fuente completo en el repositorio público de GitHub con las dos aplicaciones funcionales: la plataforma Web de autoservicio en Django (solicitud de préstamos y levantamiento de tickets) y la aplicación de Escritorio en PySide6 (consola administrativa y de resolución técnica para inventario y soporte).</w:t>
+              <w:t xml:space="preserve">Código fuente completo en el repositorio público de GitHub con las dos aplicaciones funcionales: la plataforma Web de autoservicio en Django (solicitud de asignaciones y levantamiento de tickets) y la aplicación de Escritorio en PySide6 (consola administrativa y de resolución técnica para inventario y soporte).</w:t>
             </w:r>
           </w:p>
         </w:tc>
@@ -8057,7 +8057,7 @@
                 <w:color w:val="1f3864"/>
                 <w:rtl w:val="0"/>
               </w:rPr>
-              <w:t xml:space="preserve">Código fuente y documentación técnica interactiva (vía Swagger o colección Postman) de 2 APIs RESTful creadas por el grupo en Django REST Framework (Activos/Préstamos y Service Desk/Reparaciones), más los módulos de consumo e integración de las 3 APIs externas (correo/alertas, códigos QR y autenticación).</w:t>
+              <w:t xml:space="preserve">Código fuente y documentación técnica interactiva (vía Swagger o colección Postman) de 2 APIs RESTful creadas por el grupo en Django REST Framework (Activos/asignaciones y Service Desk/Reparaciones), más los módulos de consumo e integración de las 3 APIs externas (correo/alertas, códigos QR y autenticación).</w:t>
             </w:r>
           </w:p>
         </w:tc>
@@ -9294,7 +9294,7 @@
                 <w:color w:val="548dd4"/>
                 <w:rtl w:val="0"/>
               </w:rPr>
-              <w:t xml:space="preserve">Analizar los procesos de préstamo de activos y gestión de tickets de soporte (Service Desk). Definir la Visión del Producto, diagramas de casos de uso UML, prototipos UI/UX en Figma y la arquitectura cliente-servidor desacoplada. </w:t>
+              <w:t xml:space="preserve">Analizar los procesos de asignación de activos y gestión de tickets de soporte (Service Desk). Definir la Visión del Producto, diagramas de casos de uso UML, prototipos UI/UX en Figma y la arquitectura cliente-servidor desacoplada. </w:t>
             </w:r>
           </w:p>
         </w:tc>
@@ -9555,7 +9555,7 @@
                 <w:color w:val="548dd4"/>
                 <w:rtl w:val="0"/>
               </w:rPr>
-              <w:t xml:space="preserve">Crear el repositorio público en GitHub con la estructura oficial exigida. Configurar el entorno de contenedorización con Docker y Docker Compose para levantar PostgreSQL y el backend de Django, gestionando variables de entorno en </w:t>
+              <w:t xml:space="preserve">Crear el repositorio público en GitHub con la estructura oficial exigida. Configurar el entorno de contenerización con Docker y Docker Compose para levantar PostgreSQL y el backend de Django, gestionando variables de entorno en </w:t>
             </w:r>
             <w:r>
               <w:rPr>
@@ -9757,7 +9757,7 @@
                 <w:color w:val="548dd4"/>
                 <w:rtl w:val="0"/>
               </w:rPr>
-              <w:t xml:space="preserve">Diseñar el modelo entidad-relación (ER) y generar los scripts DDL/DML normalizados en PostgreSQL para las 30 tablas divididas en activos, préstamos, tickets de falla, órdenes de trabajo, diagnósticos, repuestos y auditoría. </w:t>
+              <w:t xml:space="preserve">Diseñar el modelo entidad-relación (ER) y generar los scripts DDL/DML normalizados en PostgreSQL para las 30 tablas divididas en activos, asignaciones, tickets de falla, órdenes de trabajo, diagnósticos, repuestos y auditoría. </w:t>
             </w:r>
           </w:p>
         </w:tc>
@@ -9943,7 +9943,7 @@
                 <w:color w:val="548dd4"/>
                 <w:rtl w:val="0"/>
               </w:rPr>
-              <w:t xml:space="preserve">Implementar la aplicación Web en Django (frontend HTML5/CSS3/JS y backend): módulos de autenticación, catálogo de activos TI, solicitudes de préstamo, levantamiento de tickets de soporte y seguimiento de estados de reparación. </w:t>
+              <w:t xml:space="preserve">Implementar la aplicación Web en Django (frontend HTML5/CSS3/JS y backend): módulos de autenticación, catálogo de activos TI, solicitudes de asignación, levantamiento de tickets de soporte y seguimiento de estados de reparación. </w:t>
             </w:r>
           </w:p>
         </w:tc>
@@ -10129,7 +10129,7 @@
                 <w:color w:val="548dd4"/>
                 <w:rtl w:val="0"/>
               </w:rPr>
-              <w:t xml:space="preserve">Construir con Django REST Framework 2 APIs propias (Gestión de Activos/Préstamos y Service Desk). Integrar el consumo de 3 APIs externas: notificaciones por correo electrónico, generación/lectura de códigos QR y autenticación de usuarios. </w:t>
+              <w:t xml:space="preserve">Construir con Django REST Framework 2 APIs propias (Gestión de Activos/asignaciones y Service Desk). Integrar el consumo de 3 APIs externas: notificaciones por correo electrónico, generación/lectura de códigos QR y autenticación de usuarios. </w:t>
             </w:r>
           </w:p>
         </w:tc>

</xml_diff>